<commit_message>
dernier ajout avec le TP
</commit_message>
<xml_diff>
--- a/Groupes et utilisateurs/Cléo Deroo Groupes et utilisateurs.docx
+++ b/Groupes et utilisateurs/Cléo Deroo Groupes et utilisateurs.docx
@@ -1032,6 +1032,221 @@
                     <a:xfrm>
                       <a:off x="0" y="0"/>
                       <a:ext cx="5079365" cy="2176871"/>
+                    </a:xfrm>
+                    <a:prstGeom prst="rect">
+                      <a:avLst/>
+                    </a:prstGeom>
+                  </pic:spPr>
+                </pic:pic>
+              </a:graphicData>
+            </a:graphic>
+          </wp:inline>
+        </w:drawing>
+      </w:r>
+    </w:p>
+    <w:p>
+      <w:r>
+        <w:lastRenderedPageBreak/>
+        <w:t xml:space="preserve">Ensuite on avait ce </w:t>
+      </w:r>
+      <w:proofErr w:type="spellStart"/>
+      <w:r>
+        <w:t>tp</w:t>
+      </w:r>
+      <w:proofErr w:type="spellEnd"/>
+      <w:r>
+        <w:t xml:space="preserve"> à faire ou il fallait créer des répertoires et mettre des droits.</w:t>
+      </w:r>
+    </w:p>
+    <w:p>
+      <w:r>
+        <w:drawing>
+          <wp:inline distT="0" distB="0" distL="0" distR="0" wp14:anchorId="212C66DA" wp14:editId="1087E5B5">
+            <wp:extent cx="5760720" cy="1758315"/>
+            <wp:effectExtent l="0" t="0" r="0" b="0"/>
+            <wp:docPr id="530756246" name="Image 1" descr="Une image contenant texte, ligne, nombre, reçu&#10;&#10;Le contenu généré par l’IA peut être incorrect."/>
+            <wp:cNvGraphicFramePr>
+              <a:graphicFrameLocks xmlns:a="http://schemas.openxmlformats.org/drawingml/2006/main" noChangeAspect="1"/>
+            </wp:cNvGraphicFramePr>
+            <a:graphic xmlns:a="http://schemas.openxmlformats.org/drawingml/2006/main">
+              <a:graphicData uri="http://schemas.openxmlformats.org/drawingml/2006/picture">
+                <pic:pic xmlns:pic="http://schemas.openxmlformats.org/drawingml/2006/picture">
+                  <pic:nvPicPr>
+                    <pic:cNvPr id="530756246" name="Image 1" descr="Une image contenant texte, ligne, nombre, reçu&#10;&#10;Le contenu généré par l’IA peut être incorrect."/>
+                    <pic:cNvPicPr/>
+                  </pic:nvPicPr>
+                  <pic:blipFill>
+                    <a:blip r:embed="rId26"/>
+                    <a:stretch>
+                      <a:fillRect/>
+                    </a:stretch>
+                  </pic:blipFill>
+                  <pic:spPr>
+                    <a:xfrm>
+                      <a:off x="0" y="0"/>
+                      <a:ext cx="5760720" cy="1758315"/>
+                    </a:xfrm>
+                    <a:prstGeom prst="rect">
+                      <a:avLst/>
+                    </a:prstGeom>
+                  </pic:spPr>
+                </pic:pic>
+              </a:graphicData>
+            </a:graphic>
+          </wp:inline>
+        </w:drawing>
+      </w:r>
+    </w:p>
+    <w:p/>
+    <w:p>
+      <w:r>
+        <w:t>La création des répertoires :</w:t>
+      </w:r>
+    </w:p>
+    <w:p>
+      <w:r>
+        <w:rPr>
+          <w:noProof/>
+        </w:rPr>
+        <w:drawing>
+          <wp:inline distT="0" distB="0" distL="0" distR="0" wp14:anchorId="1903DA26" wp14:editId="64C47362">
+            <wp:extent cx="3405554" cy="2485844"/>
+            <wp:effectExtent l="0" t="0" r="4445" b="0"/>
+            <wp:docPr id="655299121" name="Image 1" descr="Une image contenant texte, capture d’écran, logiciel, nombre&#10;&#10;Le contenu généré par l’IA peut être incorrect."/>
+            <wp:cNvGraphicFramePr>
+              <a:graphicFrameLocks xmlns:a="http://schemas.openxmlformats.org/drawingml/2006/main" noChangeAspect="1"/>
+            </wp:cNvGraphicFramePr>
+            <a:graphic xmlns:a="http://schemas.openxmlformats.org/drawingml/2006/main">
+              <a:graphicData uri="http://schemas.openxmlformats.org/drawingml/2006/picture">
+                <pic:pic xmlns:pic="http://schemas.openxmlformats.org/drawingml/2006/picture">
+                  <pic:nvPicPr>
+                    <pic:cNvPr id="655299121" name="Image 1" descr="Une image contenant texte, capture d’écran, logiciel, nombre&#10;&#10;Le contenu généré par l’IA peut être incorrect."/>
+                    <pic:cNvPicPr/>
+                  </pic:nvPicPr>
+                  <pic:blipFill>
+                    <a:blip r:embed="rId27"/>
+                    <a:stretch>
+                      <a:fillRect/>
+                    </a:stretch>
+                  </pic:blipFill>
+                  <pic:spPr>
+                    <a:xfrm>
+                      <a:off x="0" y="0"/>
+                      <a:ext cx="3413083" cy="2491340"/>
+                    </a:xfrm>
+                    <a:prstGeom prst="rect">
+                      <a:avLst/>
+                    </a:prstGeom>
+                  </pic:spPr>
+                </pic:pic>
+              </a:graphicData>
+            </a:graphic>
+          </wp:inline>
+        </w:drawing>
+      </w:r>
+    </w:p>
+    <w:p/>
+    <w:p>
+      <w:r>
+        <w:t xml:space="preserve">Le groupe technique par exemple est en </w:t>
+      </w:r>
+      <w:proofErr w:type="spellStart"/>
+      <w:r>
+        <w:t>write</w:t>
+      </w:r>
+      <w:proofErr w:type="spellEnd"/>
+      <w:r>
+        <w:t xml:space="preserve"> sur le </w:t>
+      </w:r>
+      <w:proofErr w:type="spellStart"/>
+      <w:r>
+        <w:t>tp</w:t>
+      </w:r>
+      <w:proofErr w:type="spellEnd"/>
+      <w:r>
+        <w:t xml:space="preserve"> donc on le modifie ici.</w:t>
+      </w:r>
+    </w:p>
+    <w:p>
+      <w:r>
+        <w:rPr>
+          <w:noProof/>
+        </w:rPr>
+        <w:drawing>
+          <wp:inline distT="0" distB="0" distL="0" distR="0" wp14:anchorId="1208A985" wp14:editId="71A189D2">
+            <wp:extent cx="3601194" cy="2306320"/>
+            <wp:effectExtent l="0" t="0" r="0" b="0"/>
+            <wp:docPr id="210623337" name="Image 1" descr="Une image contenant texte, capture d’écran, logiciel, affichage&#10;&#10;Le contenu généré par l’IA peut être incorrect."/>
+            <wp:cNvGraphicFramePr>
+              <a:graphicFrameLocks xmlns:a="http://schemas.openxmlformats.org/drawingml/2006/main" noChangeAspect="1"/>
+            </wp:cNvGraphicFramePr>
+            <a:graphic xmlns:a="http://schemas.openxmlformats.org/drawingml/2006/main">
+              <a:graphicData uri="http://schemas.openxmlformats.org/drawingml/2006/picture">
+                <pic:pic xmlns:pic="http://schemas.openxmlformats.org/drawingml/2006/picture">
+                  <pic:nvPicPr>
+                    <pic:cNvPr id="210623337" name="Image 1" descr="Une image contenant texte, capture d’écran, logiciel, affichage&#10;&#10;Le contenu généré par l’IA peut être incorrect."/>
+                    <pic:cNvPicPr/>
+                  </pic:nvPicPr>
+                  <pic:blipFill>
+                    <a:blip r:embed="rId28"/>
+                    <a:stretch>
+                      <a:fillRect/>
+                    </a:stretch>
+                  </pic:blipFill>
+                  <pic:spPr>
+                    <a:xfrm>
+                      <a:off x="0" y="0"/>
+                      <a:ext cx="3604560" cy="2308476"/>
+                    </a:xfrm>
+                    <a:prstGeom prst="rect">
+                      <a:avLst/>
+                    </a:prstGeom>
+                  </pic:spPr>
+                </pic:pic>
+              </a:graphicData>
+            </a:graphic>
+          </wp:inline>
+        </w:drawing>
+      </w:r>
+    </w:p>
+    <w:p/>
+    <w:p/>
+    <w:p>
+      <w:r>
+        <w:lastRenderedPageBreak/>
+        <w:t>Voici par exemple pour le répertoire 1.</w:t>
+      </w:r>
+    </w:p>
+    <w:p>
+      <w:r>
+        <w:rPr>
+          <w:noProof/>
+        </w:rPr>
+        <w:drawing>
+          <wp:inline distT="0" distB="0" distL="0" distR="0" wp14:anchorId="178EEC3F" wp14:editId="22A0FE4D">
+            <wp:extent cx="4218019" cy="3154680"/>
+            <wp:effectExtent l="0" t="0" r="0" b="7620"/>
+            <wp:docPr id="1572063028" name="Image 1" descr="Une image contenant texte, capture d’écran, nombre, affichage&#10;&#10;Le contenu généré par l’IA peut être incorrect."/>
+            <wp:cNvGraphicFramePr>
+              <a:graphicFrameLocks xmlns:a="http://schemas.openxmlformats.org/drawingml/2006/main" noChangeAspect="1"/>
+            </wp:cNvGraphicFramePr>
+            <a:graphic xmlns:a="http://schemas.openxmlformats.org/drawingml/2006/main">
+              <a:graphicData uri="http://schemas.openxmlformats.org/drawingml/2006/picture">
+                <pic:pic xmlns:pic="http://schemas.openxmlformats.org/drawingml/2006/picture">
+                  <pic:nvPicPr>
+                    <pic:cNvPr id="1572063028" name="Image 1" descr="Une image contenant texte, capture d’écran, nombre, affichage&#10;&#10;Le contenu généré par l’IA peut être incorrect."/>
+                    <pic:cNvPicPr/>
+                  </pic:nvPicPr>
+                  <pic:blipFill>
+                    <a:blip r:embed="rId29"/>
+                    <a:stretch>
+                      <a:fillRect/>
+                    </a:stretch>
+                  </pic:blipFill>
+                  <pic:spPr>
+                    <a:xfrm>
+                      <a:off x="0" y="0"/>
+                      <a:ext cx="4223504" cy="3158783"/>
                     </a:xfrm>
                     <a:prstGeom prst="rect">
                       <a:avLst/>

</xml_diff>